<commit_message>
Fix browser model loading and refresh project report
</commit_message>
<xml_diff>
--- a/Pokemon_Role_Classifier_Project_Report.docx
+++ b/Pokemon_Role_Classifier_Project_Report.docx
@@ -28,6 +28,10 @@
       </w:r>
       <w:r>
         <w:t>GitHub Repo：https://github.com/Yannng0220/Aitrading-dashboard</w:t>
+        <w:br/>
+      </w:r>
+      <w:r>
+        <w:t>Cloudflare 網站：https://4b1e4e1b.aitrading-dashboard.pages.dev</w:t>
       </w:r>
     </w:p>
     <w:p>
@@ -40,12 +44,12 @@
     </w:p>
     <w:p>
       <w:r>
-        <w:t>本專案是一個結合 AI 影像分類與網頁部署的實作系統。使用者只要上傳一張寶可夢圖片，系統就會分析該角色在對戰中的定位，並將結果分類為攻擊（attack）、防禦（defense）或輔助（support）。</w:t>
+        <w:t>本專案是一個結合 AI 影像分類、資料自動標註與網站部署的實作系統。使用者只要上傳一張寶可夢圖片，系統就會判斷該角色在對戰中偏向攻擊、 防禦或輔助。</w:t>
       </w:r>
     </w:p>
     <w:p>
       <w:r>
-        <w:t>本系統不只完成模型訓練，也完成從資料整理、自動標註、模型訓練、模型匯出到前端網站部署的完整流程，屬於一個可以直接展示的 AI 應用專案。</w:t>
+        <w:t>系統先利用 PokéAPI 自動建立訓練標籤，再用 PyTorch 訓練影像分類模型，最後把模型匯出成 ONNX，讓推論能直接在瀏覽器中執行，不需要 Python 後端。</w:t>
       </w:r>
     </w:p>
     <w:p>
@@ -61,7 +65,7 @@
         <w:pStyle w:val="ListBullet"/>
       </w:pPr>
       <w:r>
-        <w:t>建立一個能根據寶可夢圖片判斷其對戰定位的 AI 模型。</w:t>
+        <w:t>建立一個能根據寶可夢圖片判斷對戰定位的 AI 模型。</w:t>
       </w:r>
     </w:p>
     <w:p>
@@ -69,7 +73,7 @@
         <w:pStyle w:val="ListBullet"/>
       </w:pPr>
       <w:r>
-        <w:t>利用 PokéAPI 自動建立資料標籤，降低人工標註成本。</w:t>
+        <w:t>利用 PokéAPI 自動產生標籤，降低人工標註成本。</w:t>
       </w:r>
     </w:p>
     <w:p>
@@ -77,7 +81,7 @@
         <w:pStyle w:val="ListBullet"/>
       </w:pPr>
       <w:r>
-        <w:t>將模型轉換成瀏覽器可執行格式，讓網站不需要 Python 後端即可完成推論。</w:t>
+        <w:t>將模型部署到網站前端，讓使用者可以直接在瀏覽器中操作。</w:t>
       </w:r>
     </w:p>
     <w:p>
@@ -85,7 +89,7 @@
         <w:pStyle w:val="ListBullet"/>
       </w:pPr>
       <w:r>
-        <w:t>把 AI 模型整合到實際網頁中，提升專案展示完整度。</w:t>
+        <w:t>完成從資料整理、模型訓練到網站展示的完整 AI 應用流程。</w:t>
       </w:r>
     </w:p>
     <w:p>
@@ -101,7 +105,7 @@
         <w:pStyle w:val="ListBullet"/>
       </w:pPr>
       <w:r>
-        <w:t>使用者可上傳 JPG、PNG、WebP 等圖片。</w:t>
+        <w:t>上傳 JPG、PNG、WebP 格式的寶可夢圖片。</w:t>
       </w:r>
     </w:p>
     <w:p>
@@ -109,7 +113,7 @@
         <w:pStyle w:val="ListBullet"/>
       </w:pPr>
       <w:r>
-        <w:t>網站會先顯示圖片預覽。</w:t>
+        <w:t>即時顯示圖片預覽。</w:t>
       </w:r>
     </w:p>
     <w:p>
@@ -117,7 +121,7 @@
         <w:pStyle w:val="ListBullet"/>
       </w:pPr>
       <w:r>
-        <w:t>系統會在瀏覽器中載入 ONNX 模型進行推論。</w:t>
+        <w:t>在瀏覽器中載入 ONNX 模型進行推論。</w:t>
       </w:r>
     </w:p>
     <w:p>
@@ -125,7 +129,7 @@
         <w:pStyle w:val="ListBullet"/>
       </w:pPr>
       <w:r>
-        <w:t>輸出三種類別的機率值：attack、defense、support。</w:t>
+        <w:t>輸出 attack、defense、support 三個類別的機率。</w:t>
       </w:r>
     </w:p>
     <w:p>
@@ -133,7 +137,7 @@
         <w:pStyle w:val="ListBullet"/>
       </w:pPr>
       <w:r>
-        <w:t>顯示最可能的最終定位結果。</w:t>
+        <w:t>顯示最可能的分類結果與信心值。</w:t>
       </w:r>
     </w:p>
     <w:p>
@@ -238,7 +242,7 @@
           </w:tcPr>
           <w:p>
             <w:r>
-              <w:t>ResNet18</w:t>
+              <w:t>MobileNetV3 Small</w:t>
             </w:r>
           </w:p>
         </w:tc>
@@ -316,7 +320,7 @@
           </w:tcPr>
           <w:p>
             <w:r>
-              <w:t>版本控管與部署</w:t>
+              <w:t>網站部署</w:t>
             </w:r>
           </w:p>
         </w:tc>
@@ -326,7 +330,7 @@
           </w:tcPr>
           <w:p>
             <w:r>
-              <w:t>GitHub、GitHub Pages、GitHub Actions</w:t>
+              <w:t>Cloudflare Pages</w:t>
             </w:r>
           </w:p>
         </w:tc>
@@ -342,7 +346,7 @@
     </w:p>
     <w:p>
       <w:r>
-        <w:t>本專案使用的寶可夢圖片資料集共有 819 張。資料經過自動標註後，分為三種類別。</w:t>
+        <w:t>本專案使用 819 張寶可夢圖片，並依照 80% 訓練集、20% 測試集切分。</w:t>
       </w:r>
     </w:p>
     <w:tbl>
@@ -592,12 +596,7 @@
     </w:p>
     <w:p>
       <w:r>
-        <w:t>由於原始圖片資料沒有直接標示對戰定位，因此本專案利用 PokéAPI 的資料進行自動標註。系統會根據圖片檔名解析出寶可夢的圖鑑編號與型態，再向 PokéAPI 取得對應資料。</w:t>
-      </w:r>
-    </w:p>
-    <w:p>
-      <w:r>
-        <w:t>自動標註時會參考的資訊包括：</w:t>
+        <w:t>原始圖片本身沒有對戰定位標籤，因此本專案先利用 PokéAPI 取得寶可夢的種族值、特性、屬性與招式資料，再透過規則加權方式，自動推算每張圖片較接近的角色類型。</w:t>
       </w:r>
     </w:p>
     <w:p>
@@ -605,7 +604,7 @@
         <w:pStyle w:val="ListBullet"/>
       </w:pPr>
       <w:r>
-        <w:t>種族值（stats）</w:t>
+        <w:t>根據圖片檔名解析圖鑑編號與型態。</w:t>
       </w:r>
     </w:p>
     <w:p>
@@ -613,7 +612,7 @@
         <w:pStyle w:val="ListBullet"/>
       </w:pPr>
       <w:r>
-        <w:t>特性（abilities）</w:t>
+        <w:t>向 PokéAPI 查詢對應寶可夢資料。</w:t>
       </w:r>
     </w:p>
     <w:p>
@@ -621,7 +620,7 @@
         <w:pStyle w:val="ListBullet"/>
       </w:pPr>
       <w:r>
-        <w:t>屬性（types）</w:t>
+        <w:t>讀取 stats、abilities、types、moves。</w:t>
       </w:r>
     </w:p>
     <w:p>
@@ -629,12 +628,15 @@
         <w:pStyle w:val="ListBullet"/>
       </w:pPr>
       <w:r>
-        <w:t>招式列表（moves）</w:t>
+        <w:t>計算 attack、defense、support 三種分數。</w:t>
       </w:r>
     </w:p>
     <w:p>
+      <w:pPr>
+        <w:pStyle w:val="ListBullet"/>
+      </w:pPr>
       <w:r>
-        <w:t>系統接著透過規則加權計算 attack、defense、support 三種類型的分數，最後取最高分作為該圖片的標籤。這種方式能大幅降低人工逐張標註的時間。</w:t>
+        <w:t>將最高分對應的類別寫入 labels.csv。</w:t>
       </w:r>
     </w:p>
     <w:p>
@@ -650,7 +652,7 @@
         <w:pStyle w:val="ListNumber"/>
       </w:pPr>
       <w:r>
-        <w:t>讀取 labels.csv 與對應圖片檔案。</w:t>
+        <w:t>讀取 labels.csv 與對應圖片。</w:t>
       </w:r>
     </w:p>
     <w:p>
@@ -658,7 +660,7 @@
         <w:pStyle w:val="ListNumber"/>
       </w:pPr>
       <w:r>
-        <w:t>將圖片縮放至 224×224，並做 Normalize 標準化。</w:t>
+        <w:t>將圖片縮放至 224 × 224，並進行 Normalize 標準化。</w:t>
       </w:r>
     </w:p>
     <w:p>
@@ -666,7 +668,7 @@
         <w:pStyle w:val="ListNumber"/>
       </w:pPr>
       <w:r>
-        <w:t>使用 ResNet18 作為影像分類模型。</w:t>
+        <w:t>使用 MobileNetV3 Small 進行三分類訓練。</w:t>
       </w:r>
     </w:p>
     <w:p>
@@ -674,7 +676,7 @@
         <w:pStyle w:val="ListNumber"/>
       </w:pPr>
       <w:r>
-        <w:t>輸出三分類結果：attack、defense、support。</w:t>
+        <w:t>搭配 class-weighted loss 與 balanced sampler，降低類別不平衡影響。</w:t>
       </w:r>
     </w:p>
     <w:p>
@@ -682,7 +684,7 @@
         <w:pStyle w:val="ListNumber"/>
       </w:pPr>
       <w:r>
-        <w:t>訓練時使用 class-weighted loss 與 balanced sampler，降低類別不平衡影響。</w:t>
+        <w:t>保存驗證表現最佳的模型權重到 artifacts/best_model.pt。</w:t>
       </w:r>
     </w:p>
     <w:p>
@@ -690,7 +692,7 @@
         <w:pStyle w:val="ListNumber"/>
       </w:pPr>
       <w:r>
-        <w:t>保存驗證表現最佳的模型權重 best_model.pt。</w:t>
+        <w:t>匯出成瀏覽器可使用的 ONNX 模型。</w:t>
       </w:r>
     </w:p>
     <w:p>
@@ -789,7 +791,7 @@
           </w:tcPr>
           <w:p>
             <w:r>
-              <w:t>0.5111</w:t>
+              <w:t>0.5455</w:t>
             </w:r>
           </w:p>
         </w:tc>
@@ -799,7 +801,7 @@
           </w:tcPr>
           <w:p>
             <w:r>
-              <w:t>0.4792</w:t>
+              <w:t>0.7500</w:t>
             </w:r>
           </w:p>
         </w:tc>
@@ -809,7 +811,7 @@
           </w:tcPr>
           <w:p>
             <w:r>
-              <w:t>0.4946</w:t>
+              <w:t>0.6316</w:t>
             </w:r>
           </w:p>
         </w:tc>
@@ -841,7 +843,7 @@
           </w:tcPr>
           <w:p>
             <w:r>
-              <w:t>0.5600</w:t>
+              <w:t>0.6757</w:t>
             </w:r>
           </w:p>
         </w:tc>
@@ -851,7 +853,7 @@
           </w:tcPr>
           <w:p>
             <w:r>
-              <w:t>0.4242</w:t>
+              <w:t>0.3788</w:t>
             </w:r>
           </w:p>
         </w:tc>
@@ -861,7 +863,7 @@
           </w:tcPr>
           <w:p>
             <w:r>
-              <w:t>0.4828</w:t>
+              <w:t>0.4854</w:t>
             </w:r>
           </w:p>
         </w:tc>
@@ -893,7 +895,7 @@
           </w:tcPr>
           <w:p>
             <w:r>
-              <w:t>0.4638</w:t>
+              <w:t>0.5410</w:t>
             </w:r>
           </w:p>
         </w:tc>
@@ -903,7 +905,7 @@
           </w:tcPr>
           <w:p>
             <w:r>
-              <w:t>0.6400</w:t>
+              <w:t>0.6600</w:t>
             </w:r>
           </w:p>
         </w:tc>
@@ -913,7 +915,7 @@
           </w:tcPr>
           <w:p>
             <w:r>
-              <w:t>0.5378</w:t>
+              <w:t>0.5946</w:t>
             </w:r>
           </w:p>
         </w:tc>
@@ -931,12 +933,12 @@
     </w:tbl>
     <w:p>
       <w:r>
-        <w:t>整體 accuracy：0.5061（約 50.61%）</w:t>
+        <w:t>整體 accuracy：0.5732（約 57.32%）</w:t>
       </w:r>
     </w:p>
     <w:p>
       <w:r>
-        <w:t>這代表模型已具備三分類能力，但仍有優化空間，例如增加資料量、調整標籤規則或導入更強的模型。</w:t>
+        <w:t>這代表模型已經能對三種類型做出有效區分，但未來仍可透過增加資料量、強化標籤規則與調整模型結構來持續提升。</w:t>
       </w:r>
     </w:p>
     <w:p>
@@ -949,12 +951,7 @@
     </w:p>
     <w:p>
       <w:r>
-        <w:t>為了讓模型可以直接在網站上執行，本專案將 PyTorch 訓練好的模型轉換成 ONNX 格式，並在前端使用 ONNX Runtime Web 進行推論。使用者上傳圖片後，網站會在本地瀏覽器完成模型運算，不需要 Python 後端。</w:t>
-      </w:r>
-    </w:p>
-    <w:p>
-      <w:r>
-        <w:t>網站推論流程如下：</w:t>
+        <w:t>本專案將 ONNX 模型與前端頁面一起部署到 Cloudflare Pages。部署後，網站會在使用者的瀏覽器中直接載入模型並完成推論，因此不需要伺服器端 Python 環境。</w:t>
       </w:r>
     </w:p>
     <w:p>
@@ -962,7 +959,7 @@
         <w:pStyle w:val="ListNumber"/>
       </w:pPr>
       <w:r>
-        <w:t>使用者上傳圖片。</w:t>
+        <w:t>使用者上傳寶可夢圖片。</w:t>
       </w:r>
     </w:p>
     <w:p>
@@ -970,7 +967,7 @@
         <w:pStyle w:val="ListNumber"/>
       </w:pPr>
       <w:r>
-        <w:t>前端將圖片縮放為 224×224。</w:t>
+        <w:t>前端先顯示預覽，並將圖片縮放到 224 × 224。</w:t>
       </w:r>
     </w:p>
     <w:p>
@@ -978,7 +975,7 @@
         <w:pStyle w:val="ListNumber"/>
       </w:pPr>
       <w:r>
-        <w:t>依照模型設定進行 Normalize。</w:t>
+        <w:t>依照 model-config.json 進行標準化。</w:t>
       </w:r>
     </w:p>
     <w:p>
@@ -986,7 +983,7 @@
         <w:pStyle w:val="ListNumber"/>
       </w:pPr>
       <w:r>
-        <w:t>使用 ONNX Runtime Web 載入 ONNX 模型。</w:t>
+        <w:t>使用 ONNX Runtime Web 載入 web/pokemon-role-classifier.onnx。</w:t>
       </w:r>
     </w:p>
     <w:p>
@@ -994,7 +991,7 @@
         <w:pStyle w:val="ListNumber"/>
       </w:pPr>
       <w:r>
-        <w:t>輸出 logits，轉成 softmax 機率。</w:t>
+        <w:t>取得三個類別的 logits，轉成 softmax 機率。</w:t>
       </w:r>
     </w:p>
     <w:p>
@@ -1002,7 +999,7 @@
         <w:pStyle w:val="ListNumber"/>
       </w:pPr>
       <w:r>
-        <w:t>顯示 attack、defense、support 機率與最終分類結果。</w:t>
+        <w:t>顯示最終分類結果與信心值。</w:t>
       </w:r>
     </w:p>
     <w:p>
@@ -1018,12 +1015,12 @@
         <w:pStyle w:val="Heading2"/>
       </w:pPr>
       <w:r>
-        <w:t>1. 整體系統流程圖</w:t>
+        <w:t>1. 整體系統流程</w:t>
       </w:r>
     </w:p>
     <w:p>
       <w:r>
-        <w:t>寶可夢圖片資料集 → PokéAPI 自動標註 → labels.csv → ResNet18 訓練 → best_model.pt → 匯出 ONNX → 網頁載入模型 → 使用者上傳圖片 → 瀏覽器端推論 → 輸出 attack / defense / support</w:t>
+        <w:t>寶可夢圖片資料集 → PokéAPI 自動標註 → labels.csv → MobileNetV3 Small 訓練 → best_model.pt → 匯出 ONNX → Cloudflare Pages 網站載入模型 → 使用者上傳圖片 → 瀏覽器端推論 → 顯示 attack / defense / support</w:t>
       </w:r>
     </w:p>
     <w:p>
@@ -1031,12 +1028,12 @@
         <w:pStyle w:val="Heading2"/>
       </w:pPr>
       <w:r>
-        <w:t>2. 自動標註流程圖</w:t>
+        <w:t>2. 自動標註流程</w:t>
       </w:r>
     </w:p>
     <w:p>
       <w:r>
-        <w:t>圖片檔名解析 → 取得圖鑑編號與型態 → 查詢 PokéAPI → 讀取 stats / abilities / types / moves → 規則加權評分 → 產生 attack / defense / support 分數 → 選取最高分 → 寫入 labels.csv</w:t>
+        <w:t>圖片檔名解析 → 取得圖鑑編號與型態 → 查詢 PokéAPI → 讀取 stats / abilities / types / moves → 規則加權評分 → 選取最高分 → 寫入 labels.csv</w:t>
       </w:r>
     </w:p>
     <w:p>
@@ -1044,12 +1041,12 @@
         <w:pStyle w:val="Heading2"/>
       </w:pPr>
       <w:r>
-        <w:t>3. 模型訓練流程圖</w:t>
+        <w:t>3. 模型訓練流程</w:t>
       </w:r>
     </w:p>
     <w:p>
       <w:r>
-        <w:t>labels.csv + 圖片 → 影像前處理 → ResNet18 → 三分類輸出 → loss 計算 → 權重更新 → 保存最佳模型</w:t>
+        <w:t>labels.csv + 圖片 → 影像前處理 → MobileNetV3 Small → 三分類輸出 → loss 計算 → 權重更新 → 保存最佳模型</w:t>
       </w:r>
     </w:p>
     <w:p>
@@ -1057,7 +1054,7 @@
         <w:pStyle w:val="Heading2"/>
       </w:pPr>
       <w:r>
-        <w:t>4. 網頁推論流程圖</w:t>
+        <w:t>4. 網頁推論流程</w:t>
       </w:r>
     </w:p>
     <w:p>
@@ -1167,7 +1164,7 @@
           </w:tcPr>
           <w:p>
             <w:r>
-              <w:t>模型訓練主程式，使用 ResNet18 完成三分類訓練</w:t>
+              <w:t>模型訓練主程式，使用 MobileNetV3 Small 完成三分類訓練</w:t>
             </w:r>
           </w:p>
         </w:tc>
@@ -1289,7 +1286,7 @@
           </w:tcPr>
           <w:p>
             <w:r>
-              <w:t>web/pokemon-role-classifier.onnx</w:t>
+              <w:t>web/model-config.json</w:t>
             </w:r>
           </w:p>
         </w:tc>
@@ -1299,7 +1296,7 @@
           </w:tcPr>
           <w:p>
             <w:r>
-              <w:t>提供瀏覽器執行的模型檔</w:t>
+              <w:t>模型輸入大小、類別名稱與正規化參數設定</w:t>
             </w:r>
           </w:p>
         </w:tc>
@@ -1311,7 +1308,7 @@
           </w:tcPr>
           <w:p>
             <w:r>
-              <w:t>web/model-config.json</w:t>
+              <w:t>web/pokemon-role-classifier.onnx</w:t>
             </w:r>
           </w:p>
         </w:tc>
@@ -1321,7 +1318,7 @@
           </w:tcPr>
           <w:p>
             <w:r>
-              <w:t>模型輸入大小、類別名稱、正規化參數設定</w:t>
+              <w:t>提供瀏覽器執行的 ONNX 模型</w:t>
             </w:r>
           </w:p>
         </w:tc>
@@ -1333,7 +1330,7 @@
           </w:tcPr>
           <w:p>
             <w:r>
-              <w:t>labels.csv</w:t>
+              <w:t>Pokemon_Role_Classifier_Project_Report.docx</w:t>
             </w:r>
           </w:p>
         </w:tc>
@@ -1343,7 +1340,7 @@
           </w:tcPr>
           <w:p>
             <w:r>
-              <w:t>自動標註後的資料表</w:t>
+              <w:t>專案介紹 Word 報告</w:t>
             </w:r>
           </w:p>
         </w:tc>
@@ -1362,15 +1359,7 @@
         <w:pStyle w:val="ListBullet"/>
       </w:pPr>
       <w:r>
-        <w:t>不是只有訓練模型，而是完成從資料、標籤、模型到網站部署的完整流程。</w:t>
-      </w:r>
-    </w:p>
-    <w:p>
-      <w:pPr>
-        <w:pStyle w:val="ListBullet"/>
-      </w:pPr>
-      <w:r>
-        <w:t>使用 PokéAPI 自動標註，減少大量人工整理工作。</w:t>
+        <w:t>完成從資料整理、自動標註、模型訓練到網站部署的完整流程。</w:t>
       </w:r>
     </w:p>
     <w:p>
@@ -1386,7 +1375,15 @@
         <w:pStyle w:val="ListBullet"/>
       </w:pPr>
       <w:r>
-        <w:t>適合作為 AI 專案作品集、專題展示或剪報報告內容。</w:t>
+        <w:t>使用 Cloudflare Pages 部署，方便直接公開展示。</w:t>
+      </w:r>
+    </w:p>
+    <w:p>
+      <w:pPr>
+        <w:pStyle w:val="ListBullet"/>
+      </w:pPr>
+      <w:r>
+        <w:t>適合作為 AI 專題、作品集或剪報報告主題。</w:t>
       </w:r>
     </w:p>
     <w:p>
@@ -1402,7 +1399,7 @@
         <w:pStyle w:val="ListBullet"/>
       </w:pPr>
       <w:r>
-        <w:t>目前標籤是透過規則推論產生，不是官方直接提供的戰術定位。</w:t>
+        <w:t>標籤是依照規則推論產生，不是官方直接提供的對戰定位。</w:t>
       </w:r>
     </w:p>
     <w:p>
@@ -1410,7 +1407,7 @@
         <w:pStyle w:val="ListBullet"/>
       </w:pPr>
       <w:r>
-        <w:t>資料量仍偏小，圖片風格差異可能影響模型判斷。</w:t>
+        <w:t>資料量仍有限，不同畫風與構圖可能影響模型判斷。</w:t>
       </w:r>
     </w:p>
     <w:p>
@@ -1418,7 +1415,7 @@
         <w:pStyle w:val="ListBullet"/>
       </w:pPr>
       <w:r>
-        <w:t>系統只看圖片，不看實際對戰隊伍搭配、個體值或努力值。</w:t>
+        <w:t>系統只看圖片，不會分析實際配招、個體值或隊伍搭配。</w:t>
       </w:r>
     </w:p>
     <w:p>
@@ -1426,7 +1423,7 @@
         <w:pStyle w:val="ListBullet"/>
       </w:pPr>
       <w:r>
-        <w:t>ONNX 模型檔較大，網站首次載入時需要較多時間。</w:t>
+        <w:t>首次進站時仍需要載入 ONNX 模型，會有少量等待時間。</w:t>
       </w:r>
     </w:p>
     <w:p>
@@ -1450,7 +1447,7 @@
         <w:pStyle w:val="ListBullet"/>
       </w:pPr>
       <w:r>
-        <w:t>優化標籤規則，提高 attack / defense / support 的區分能力。</w:t>
+        <w:t>優化 PokéAPI 自動標註規則，提高標籤品質。</w:t>
       </w:r>
     </w:p>
     <w:p>
@@ -1458,7 +1455,7 @@
         <w:pStyle w:val="ListBullet"/>
       </w:pPr>
       <w:r>
-        <w:t>導入更強的影像模型架構。</w:t>
+        <w:t>加入非寶可夢圖片辨識，避免模型硬分三類。</w:t>
       </w:r>
     </w:p>
     <w:p>
@@ -1466,7 +1463,7 @@
         <w:pStyle w:val="ListBullet"/>
       </w:pPr>
       <w:r>
-        <w:t>加入是否為寶可夢的前置辨識功能。</w:t>
+        <w:t>嘗試多模型比較或特徵融合，提高準確率。</w:t>
       </w:r>
     </w:p>
     <w:p>
@@ -1474,7 +1471,7 @@
         <w:pStyle w:val="ListBullet"/>
       </w:pPr>
       <w:r>
-        <w:t>加入更多對戰定位類別，例如速度型、坦克型、法術輸出型。</w:t>
+        <w:t>擴充更多角色類別，例如速度型、坦克型、特殊輸出型。</w:t>
       </w:r>
     </w:p>
     <w:p>
@@ -1487,7 +1484,7 @@
     </w:p>
     <w:p>
       <w:r>
-        <w:t>本專案是一個寶可夢圖片定位分類系統。使用者只需要上傳一張寶可夢圖片，系統就會判斷它在對戰中偏向攻擊、防禦還是輔助。專案首先利用 PokéAPI 取得寶可夢的種族值、特性、屬性與招式資料，透過規則自動建立訓練標籤，再使用 ResNet18 模型進行影像分類訓練。訓練完成後，模型會被轉成 ONNX 格式，並部署到網頁前端，讓整個推論流程可以直接在瀏覽器中執行，不需要 Python 後端。這個專案的重點在於完成了從資料處理、模型訓練到網站部署的完整 AI 應用流程。</w:t>
+        <w:t>本專案是一個寶可夢圖片定位分類系統。使用者上傳一張寶可夢圖片後，系統會判斷它在對戰中較偏向攻擊、防禦或輔助。專案先透過 PokéAPI 取得寶可夢的種族值、特性、屬性與招式資料，自動建立訓練標籤，再使用 MobileNetV3 Small 進行影像分類訓練。訓練完成後，模型被轉為 ONNX 格式，部署到 Cloudflare Pages，讓整個推論流程可以直接在瀏覽器中完成，不需要 Python 後端。這個專案的重點在於完成了從資料、模型到網站部署的完整 AI 應用流程。</w:t>
       </w:r>
     </w:p>
     <w:p>
@@ -1503,7 +1500,7 @@
         <w:pStyle w:val="ListBullet"/>
       </w:pPr>
       <w:r>
-        <w:t>最新本地 commit：434a2d9 Fix GitHub Pages workflow setup</w:t>
+        <w:t>GitHub Repo：https://github.com/Yannng0220/Aitrading-dashboard</w:t>
       </w:r>
     </w:p>
     <w:p>
@@ -1511,15 +1508,7 @@
         <w:pStyle w:val="ListBullet"/>
       </w:pPr>
       <w:r>
-        <w:t>前一版網站主 commit：0ef8c6a Deploy Pokemon role classifier web app</w:t>
-      </w:r>
-    </w:p>
-    <w:p>
-      <w:pPr>
-        <w:pStyle w:val="ListBullet"/>
-      </w:pPr>
-      <w:r>
-        <w:t>GitHub Repo：https://github.com/Yannng0220/Aitrading-dashboard</w:t>
+        <w:t>Cloudflare 網站：https://4b1e4e1b.aitrading-dashboard.pages.dev</w:t>
       </w:r>
     </w:p>
     <w:p>
@@ -1536,6 +1525,14 @@
       </w:pPr>
       <w:r>
         <w:t>模型輸出類別：attack、defense、support</w:t>
+      </w:r>
+    </w:p>
+    <w:p>
+      <w:pPr>
+        <w:pStyle w:val="ListBullet"/>
+      </w:pPr>
+      <w:r>
+        <w:t>網站前端模型：web/pokemon-role-classifier.onnx</w:t>
       </w:r>
     </w:p>
     <w:sectPr>

</xml_diff>